<commit_message>
docs: record Baidu partner consultation submission
</commit_message>
<xml_diff>
--- a/cloud-entry-package/materials/SAEE_BAIDU_PARTNER_PRODUCT_SOLUTION_V1.docx
+++ b/cloud-entry-package/materials/SAEE_BAIDU_PARTNER_PRODUCT_SOLUTION_V1.docx
@@ -49,7 +49,7 @@
           <w:color w:val="172033"/>
           <w:sz w:val="22"/>
         </w:rPr>
-        <w:t>文档状态：本地申请附件候选；公司字段待负责人补全；未提交</w:t>
+        <w:t>文档状态：千帆伙伴咨询已提交；更高阶合作资质字段仍待负责人补全</w:t>
       </w:r>
     </w:p>
     <w:p>
@@ -98,7 +98,7 @@
         <w:pStyle w:val="Heading1"/>
       </w:pPr>
       <w:r>
-        <w:t>1. 申请主体信息（负责人必填）</w:t>
+        <w:t>1. 后续合作主体信息（负责人必填）</w:t>
       </w:r>
     </w:p>
     <w:p>
@@ -538,7 +538,7 @@
           <w:color w:val="172033"/>
           <w:sz w:val="22"/>
         </w:rPr>
-        <w:t>当前 Alpha 已完成两个只读 MCP 工具和 Qianfan-style 离线 host simulation；尚未访问 BOS，也没有真实 Qianfan 产品 roundtrip。</w:t>
+        <w:t>当前 Alpha 已完成两个只读 MCP 工具、Qianfan-style 离线 host simulation，以及两个合成业务场景的真实 Qianfan 产品 roundtrip；尚未访问 BOS，也不构成官方千帆集成。</w:t>
       </w:r>
     </w:p>
     <w:p>
@@ -630,7 +630,7 @@
           <w:color w:val="172033"/>
           <w:sz w:val="22"/>
         </w:rPr>
-        <w:t>第一步：在负责人补全主体/联系人并授权后，提交千帆伙伴咨询，方向为产品集成与应用场景共建。</w:t>
+        <w:t>第一步：千帆伙伴咨询已按授权提交，方向为产品集成与应用场景共建；等待并记录百度反馈。</w:t>
       </w:r>
     </w:p>
     <w:p>
@@ -641,7 +641,7 @@
           <w:color w:val="172033"/>
           <w:sz w:val="22"/>
         </w:rPr>
-        <w:t>第二步：完成真实 Qianfan 产品两工具 roundtrip 和百度工程审阅。</w:t>
+        <w:t>第二步：两个真实 Qianfan 合成场景 roundtrip 已完成；下一项是百度工程审阅，不把 provider 调用升级为官方集成。</w:t>
       </w:r>
     </w:p>
     <w:p>
@@ -769,7 +769,7 @@
           <w:color w:val="9B1C1C"/>
           <w:sz w:val="22"/>
         </w:rPr>
-        <w:t>禁止在未授权前上传、提交、接受协议或填写联系人个人数据。</w:t>
+        <w:t>千帆伙伴咨询已按授权提交；后续上传附件、接受协议或向其他入口复用联系人数据仍需单独授权。</w:t>
       </w:r>
     </w:p>
     <w:sectPr>
@@ -798,7 +798,7 @@
         <w:color w:val="536078"/>
         <w:sz w:val="16"/>
       </w:rPr>
-      <w:t>local handoff draft · external submission=false</w:t>
+      <w:t>partner consultation submitted · marketplace submission=false</w:t>
     </w:r>
   </w:p>
 </w:ftr>

</xml_diff>